<commit_message>
Explanation doc: copper expression intent, storyline handling for case 3
Co-Authored-By: Claude Opus 5.5 <noreply@anthropic.com>
Claude-Session: https://claude.ai/code/session_01RaAHJjFzQLBQzv3hdCW4ED
</commit_message>
<xml_diff>
--- a/cover-proposals/v15_1007_send_pwc/台割案2・案3_構成の考え方.docx
+++ b/cover-proposals/v15_1007_send_pwc/台割案2・案3_構成の考え方.docx
@@ -82,7 +82,7 @@
         <w:spacing w:after="120"/>
       </w:pPr>
       <w:r>
-        <w:t>原料炭は、ストーリーラインで★とされた「BHPと50:50の合弁」が一目で分かるよう、出資構成の図を加えました。そのうえで、世界最高品位の原料炭を持つこと、それが鉄の主原料であり、鉄は今後も必要とされ、ゆえに社会に不可欠であるという、社会的な必要性の文脈で語っています。銅は、参考資料で「ノンオペレーターとして世界最大」という言い方が消極的に受け取られる懸念が示されていたことを踏まえ、数字よりも「パートナーが多く、規模が大きく、業界と幅広い関係を持つから、新しい案件で声がかかる存在である」という本文を主役にしました。</w:t>
+        <w:t>原料炭は、ストーリーラインで★とされた「BHPと50:50の合弁」が一目で分かるよう、出資構成の図を加えました。そのうえで、世界最高品位の原料炭を持つこと、それが鉄の主原料であり、鉄は今後も必要とされ、ゆえに社会に不可欠であるという、社会的な必要性の文脈で語っています。銅の見せ方については、前回ご指摘をいただいた点でもあるため、末尾に考え方をまとめました。</w:t>
       </w:r>
     </w:p>
     <w:p>
@@ -167,7 +167,7 @@
         <w:spacing w:after="120"/>
       </w:pPr>
       <w:r>
-        <w:t>案③は、ストーリーラインの掲載項目はすべて残したうえで、順番と強弱を組み替えた提案です。骨格にしたのは、コアメッセージの「Strength to Hold. Power to Connect.」です。前半で「持つ力」、つまり一級資産を持っていることを証明し、後半で「つなぐ力」、つまりパートナーシップと販売網、そしてバリューチェーン全体をつなぐ力を証明して締める、という一本の筋にしました。順番は、同時に制作している動画の絵コンテとそろえ、営業の方が冊子と動画を同じ話の流れで使えるようにしています。</w:t>
+        <w:t>案③は、ストーリーラインの4章構成と読み手の心理の流れ、掲載項目はすべて維持したうえで、2つの項目の置き場所と、全体の強弱を組み替えた提案です。ストーリーラインは三菱商事様とすり合わせ済みのものと理解しておりますので、これを崩す意図ではなく、9/8の資料で「今後の検討の中で詰めていく」とされていた順番・強弱・見せ方について、私どもの考えをお示しするものです。骨格にしたのは、コアメッセージの「Strength to Hold. Power to Connect.」です。前半で「持つ力」、つまり一級資産を持っていることを証明し、後半で「つなぐ力」、つまりパートナーシップと販売網、そしてバリューチェーン全体をつなぐ力を証明して締める、という一本の筋にしました。順番は、同時に制作している動画の絵コンテとそろえ、営業の方が冊子と動画を同じ話の流れで使えるようにしています。</w:t>
       </w:r>
     </w:p>
     <w:p>
@@ -175,7 +175,7 @@
         <w:spacing w:after="120"/>
       </w:pPr>
       <w:r>
-        <w:t>最も大きな変更は、ストーリーラインでは第4章にあった外部環境と社会課題を冒頭に移したことです。ストーリーラインの留意点にある「金属は経済活動を支える礎であり、儲けるためではなく社会に必要な資源を支える責務として表現する」という考え方は、最後に置くよりも最初に示すほうが、冊子全体の姿勢として伝わると考えました。動画も社会貢献から入る構成になっており、読み手の関心を相手側の課題から始められます。</w:t>
+        <w:t>動かした項目の一つ目は、第4章の外部環境と社会課題です。この内容の要点を、導入の中に「問い」として先に置きました（締めの「私たちの約束」は第4章の位置に残しています）。ストーリーラインの留意点にある「金属は経済活動を支える礎であり、儲けるためではなく社会に必要な資源を支える責務として表現する」という考え方は、最後に置くよりも最初に示すほうが、冊子全体の姿勢として伝わると考えました。動画も社会貢献から入る構成になっており、読み手の関心を相手側の課題から始められます。</w:t>
       </w:r>
     </w:p>
     <w:p>
@@ -207,7 +207,7 @@
         <w:spacing w:after="120"/>
       </w:pPr>
       <w:r>
-        <w:t>強調箇所の二つ目は、バリューチェーンです。ストーリーラインでは第1章の前提理解として置かれていましたが、案③では冊子の結論として最後の見開きに置いています。資産とパートナーを見た後に全体像を示すほうが、「だからこの会社と組む意味がある」と納得しやすいと考えたためです。鉄鋼と非鉄の流れを川上から川下まで並べ、メタルワンが別グループであることは注記にとどめました。あわせて、参考資料で「投資と販売の連携がアイデンティティ」とされていた、持分のオフテイクをRtMが販売し、顧客から得た情報を投資判断に還元する好循環も、ここで示しています。最後はグループミッションと、安定供給・効率的な供給という外部環境への答えで締めています。</w:t>
+        <w:t>動かした項目の二つ目であり、強調箇所の二つ目でもあるのが、バリューチェーンです。ストーリーラインでは第1章の前提理解として置かれていましたが、案③では冊子の結論として最後の見開きに置いています。資産とパートナーを見た後に全体像を示すほうが、「だからこの会社と組む意味がある」と納得しやすいと考えたためです。鉄鋼と非鉄の流れを川上から川下まで並べ、メタルワンが別グループであることは注記にとどめました。あわせて、参考資料で「投資と販売の連携がアイデンティティ」とされていた、持分のオフテイクをRtMが販売し、顧客から得た情報を投資判断に還元する好循環も、ここで示しています。最後はグループミッションと、安定供給・効率的な供給という外部環境への答えで締めています。</w:t>
       </w:r>
     </w:p>
     <w:p>
@@ -257,6 +257,42 @@
           <w:rFonts w:ascii="Yu Gothic" w:hAnsi="Yu Gothic" w:eastAsia="Yu Gothic"/>
           <w:color w:val="23272C"/>
         </w:rPr>
+        <w:t>銅の見せ方について</w:t>
+      </w:r>
+    </w:p>
+    <w:p>
+      <w:pPr>
+        <w:spacing w:after="120"/>
+      </w:pPr>
+      <w:r>
+        <w:t>銅については、前回「この表現でよかったか」とのご指摘をいただいておりました。参考資料（P22・P24）では、社内で多用している「ノンオペレーターとして世界最大」という言い方が、予備知識のない読み手には「操業していない」という消極的な意味に受け取られかねないこと、また「世界第20位」が小さく見える懸念があることが示されています。一方で、本来伝えたいのは、自社で操業しなくても世界最大級になり得る背景、つまり販売力と長年の実績に裏打ちされた「業界内で声がかかりやすい存在」であることと、特定の1社に偏らず主要メジャーのほぼすべてと実際に協業していること、と整理されていました。</w:t>
+      </w:r>
+    </w:p>
+    <w:p>
+      <w:pPr>
+        <w:spacing w:after="120"/>
+      </w:pPr>
+      <w:r>
+        <w:t>そこで案②・案③では、ページの主役を「なぜ声がかかるのか」に置いています。案②では、パートナーが多く、規模が大きく、販売を通じて業界と幅広い関係を持つ、という3つの理由を本文の中心にしました。案③では、それを裏付ける根拠として、早い時期から優良鉱山に参画してきた年表と、生産量の比較を加えています。比較には、上位に協業の難しい国有・政府系企業が含まれること、協業可能でオペレーターシップを求めないパートナーとしては最大規模であることを注記し、「20位」が見劣りしないようにしました。</w:t>
+      </w:r>
+    </w:p>
+    <w:p>
+      <w:pPr>
+        <w:spacing w:after="120"/>
+      </w:pPr>
+      <w:r>
+        <w:t>ただし、両案とも英文の大見出しには、仮に「The world's largest non-operating copper producer.」を置いたままです。懸念のある言葉を最も目立つ位置に使っていることになるため、私どもとしては見出しを差し替え、事実としての「自社操業を伴わない参画者として世界最大」は本文と数字の側で伝えることをご提案します。見出しの案としては、「The partner the copper industry calls first.（銅業界で、最初に声がかかるパートナー）」や「Partnering with the world's leading copper mines.（世界の主要銅鉱山とともに）」を考えております。どの言い方が適切かは、三菱商事様のご意向を伺いたい点です。</w:t>
+      </w:r>
+    </w:p>
+    <w:p>
+      <w:pPr>
+        <w:pStyle w:val="Heading1"/>
+      </w:pPr>
+      <w:r>
+        <w:rPr>
+          <w:rFonts w:ascii="Yu Gothic" w:hAnsi="Yu Gothic" w:eastAsia="Yu Gothic"/>
+          <w:color w:val="23272C"/>
+        </w:rPr>
         <w:t>私どもの考えと、ご相談したい点</w:t>
       </w:r>
     </w:p>
@@ -273,7 +309,15 @@
         <w:spacing w:after="120"/>
       </w:pPr>
       <w:r>
-        <w:t>PwC様に特にご判断をいただきたいのは、バリューチェーン全体像を冒頭（ストーリーラインどおり）と結論（案③）のどちらに置くか、外部環境を冒頭に移すことの可否、そして三菱商事とは・三綱領・組織図をどこまで載せるか、の3点です。また、原料炭側の新技術の事例、拠点・駐在として示す地域、ポートフォリオの位置付けの表現については、三菱商事様へのご確認が必要と考えております。</w:t>
+        <w:t>なお、案③はストーリーラインの4章構成は保っているものの、外部環境とバリューチェーンの2項目は、合意済みの位置から動かしています。この2点についてはPwC様・三菱商事様のご判断を優先したく、ストーリーラインどおりの位置に戻す場合も、案③のレイアウトのまま対応できます（外部環境は第4章へ、バリューチェーンは第2章の締めへ）。</w:t>
+      </w:r>
+    </w:p>
+    <w:p>
+      <w:pPr>
+        <w:spacing w:after="120"/>
+      </w:pPr>
+      <w:r>
+        <w:t>PwC様に特にご判断をいただきたいのは、バリューチェーン全体像を冒頭（ストーリーラインどおり）と結論（案③）のどちらに置くか、外部環境を冒頭に移すことの可否、三菱商事とは・三綱領・組織図をどこまで載せるか、そして銅の見出しの表現、の4点です。また、原料炭側の新技術の事例、拠点・駐在として示す地域、ポートフォリオの位置付けの表現については、三菱商事様へのご確認が必要と考えております。</w:t>
       </w:r>
     </w:p>
     <w:p>

</xml_diff>